<commit_message>
Validation package: add release R3 (URS-120..145, OQ-31..37), refresh evidence of 2026-10-26, fix unhandled scratch-pool error in the restore drill
Requirements, mechanisms, risk rows and deviations for SPC/trending, directory sign-on, periodic review and archive,
global search, the Arabic/English interface, installer and release integrity and the built-in database. Every RTM row
points to an executed test (2183 of 2194 Vitest tests pass, shell OQ 52/52, browser 216 pass / 1 fail, Electron and
installer node:test checks 85 pass) or to an open deviation (DEV-2026-10-26-01..09). Nothing is approved or signed.

Co-Authored-By: Claude Sonnet 5.5 <noreply@anthropic.com>
Claude-Session: https://claude.ai/code/session_01SauYmXNGWpk2yfK1rWQjao
</commit_message>
<xml_diff>
--- a/validation/docs/VAL-LIMS-DIA-001-DIA.docx
+++ b/validation/docs/VAL-LIMS-DIA-001-DIA.docx
@@ -351,11 +351,11 @@
       <w:pPr>
         <w:pStyle w:val="Heading1"/>
       </w:pPr>
-      <w:bookmarkStart w:name="_Toc54" w:id="54"/>
+      <w:bookmarkStart w:name="_Toc61" w:id="61"/>
       <w:r>
         <w:t xml:space="preserve">Contents</w:t>
       </w:r>
-      <w:bookmarkEnd w:id="54"/>
+      <w:bookmarkEnd w:id="61"/>
     </w:p>
     <w:sdt>
       <w:sdtPr>
@@ -374,7 +374,7 @@
             <w:instrText xml:space="preserve">TOC \h \o "1-2"</w:instrText>
             <w:fldChar w:fldCharType="separate"/>
           </w:r>
-          <w:hyperlink w:history="1" w:anchor="_Toc54">
+          <w:hyperlink w:history="1" w:anchor="_Toc61">
             <w:r>
               <w:t xml:space="preserve">Contents</w:t>
             </w:r>
@@ -383,7 +383,7 @@
             </w:r>
             <w:r>
               <w:fldChar w:fldCharType="begin" w:dirty="true"/>
-              <w:instrText xml:space="preserve">PAGEREF _Toc54 \h</w:instrText>
+              <w:instrText xml:space="preserve">PAGEREF _Toc61 \h</w:instrText>
               <w:fldChar w:fldCharType="separate"/>
               <w:fldChar w:fldCharType="end"/>
             </w:r>
@@ -396,7 +396,7 @@
               <w:tab w:val="right" w:pos="9026" w:leader="dot"/>
             </w:tabs>
           </w:pPr>
-          <w:hyperlink w:history="1" w:anchor="_Toc55">
+          <w:hyperlink w:history="1" w:anchor="_Toc62">
             <w:r>
               <w:t xml:space="preserve">1. ALCOA+ against mechanisms</w:t>
             </w:r>
@@ -405,7 +405,7 @@
             </w:r>
             <w:r>
               <w:fldChar w:fldCharType="begin" w:dirty="true"/>
-              <w:instrText xml:space="preserve">PAGEREF _Toc55 \h</w:instrText>
+              <w:instrText xml:space="preserve">PAGEREF _Toc62 \h</w:instrText>
               <w:fldChar w:fldCharType="separate"/>
               <w:fldChar w:fldCharType="end"/>
             </w:r>
@@ -418,7 +418,7 @@
               <w:tab w:val="right" w:pos="9026" w:leader="dot"/>
             </w:tabs>
           </w:pPr>
-          <w:hyperlink w:history="1" w:anchor="_Toc56">
+          <w:hyperlink w:history="1" w:anchor="_Toc63">
             <w:r>
               <w:t xml:space="preserve">2. Residual risks and compensating controls</w:t>
             </w:r>
@@ -427,7 +427,7 @@
             </w:r>
             <w:r>
               <w:fldChar w:fldCharType="begin" w:dirty="true"/>
-              <w:instrText xml:space="preserve">PAGEREF _Toc56 \h</w:instrText>
+              <w:instrText xml:space="preserve">PAGEREF _Toc63 \h</w:instrText>
               <w:fldChar w:fldCharType="separate"/>
               <w:fldChar w:fldCharType="end"/>
             </w:r>
@@ -440,7 +440,7 @@
               <w:tab w:val="right" w:pos="9026" w:leader="dot"/>
             </w:tabs>
           </w:pPr>
-          <w:hyperlink w:history="1" w:anchor="_Toc57">
+          <w:hyperlink w:history="1" w:anchor="_Toc64">
             <w:r>
               <w:t xml:space="preserve">Approval</w:t>
             </w:r>
@@ -449,7 +449,7 @@
             </w:r>
             <w:r>
               <w:fldChar w:fldCharType="begin" w:dirty="true"/>
-              <w:instrText xml:space="preserve">PAGEREF _Toc57 \h</w:instrText>
+              <w:instrText xml:space="preserve">PAGEREF _Toc64 \h</w:instrText>
               <w:fldChar w:fldCharType="separate"/>
               <w:fldChar w:fldCharType="end"/>
             </w:r>
@@ -466,11 +466,11 @@
       <w:pPr>
         <w:pStyle w:val="Heading1"/>
       </w:pPr>
-      <w:bookmarkStart w:name="_Toc55" w:id="55"/>
+      <w:bookmarkStart w:name="_Toc62" w:id="62"/>
       <w:r>
         <w:t xml:space="preserve">1. ALCOA+ against mechanisms</w:t>
       </w:r>
-      <w:bookmarkEnd w:id="55"/>
+      <w:bookmarkEnd w:id="62"/>
     </w:p>
     <w:tbl>
       <w:tblPr>
@@ -1144,11 +1144,11 @@
       <w:pPr>
         <w:pStyle w:val="Heading1"/>
       </w:pPr>
-      <w:bookmarkStart w:name="_Toc56" w:id="56"/>
+      <w:bookmarkStart w:name="_Toc63" w:id="63"/>
       <w:r>
         <w:t xml:space="preserve">2. Residual risks and compensating controls</w:t>
       </w:r>
-      <w:bookmarkEnd w:id="56"/>
+      <w:bookmarkEnd w:id="63"/>
     </w:p>
     <w:p>
       <w:pPr>
@@ -1237,13 +1237,30 @@
     </w:p>
     <w:p>
       <w:pPr>
+        <w:pStyle w:val="ListParagraph"/>
+        <w:numPr>
+          <w:ilvl w:val="0"/>
+          <w:numId w:val="2"/>
+        </w:numPr>
+        <w:spacing w:after="90"/>
+      </w:pPr>
+      <w:r>
+        <w:rPr>
+          <w:sz w:val="21"/>
+          <w:szCs w:val="21"/>
+        </w:rPr>
+        <w:t xml:space="preserve">Release R3: directory sign-on proves identity only against a fake directory (DEV-2026-10-26-03); the release manifest and the installer are unsigned (DEV-2026-10-26-04); the built-in database is not in the installer yet (DEV-2026-10-26-02); archive bundles are verified by hash, so the archive folder needs the same access control and off-PC copy as the backups.</w:t>
+      </w:r>
+    </w:p>
+    <w:p>
+      <w:pPr>
         <w:pStyle w:val="Heading1"/>
       </w:pPr>
-      <w:bookmarkStart w:name="_Toc57" w:id="57"/>
+      <w:bookmarkStart w:name="_Toc64" w:id="64"/>
       <w:r>
         <w:t xml:space="preserve">Approval</w:t>
       </w:r>
-      <w:bookmarkEnd w:id="57"/>
+      <w:bookmarkEnd w:id="64"/>
     </w:p>
     <w:tbl>
       <w:tblPr>

</xml_diff>